<commit_message>
phase 1 backend fertig
</commit_message>
<xml_diff>
--- a/docs/Worst-Case-Scenario.docx
+++ b/docs/Worst-Case-Scenario.docx
@@ -29,32 +29,26 @@
           <w:lang w:val="en-GB"/>
         </w:rPr>
       </w:pPr>
-      <w:proofErr w:type="spellStart"/>
-      <w:r>
-        <w:rPr>
-          <w:lang w:val="en-GB"/>
-        </w:rPr>
-        <w:t>Krankheiten</w:t>
-      </w:r>
-      <w:proofErr w:type="spellEnd"/>
-      <w:r>
-        <w:rPr>
-          <w:lang w:val="en-GB"/>
-        </w:rPr>
-        <w:t>:</w:t>
-      </w:r>
     </w:p>
     <w:p>
       <w:pPr>
         <w:rPr>
-          <w:lang w:val="de-DE"/>
+          <w:lang w:val="en-GB"/>
         </w:rPr>
       </w:pPr>
-      <w:r>
-        <w:rPr>
-          <w:lang w:val="de-DE"/>
-        </w:rPr>
-        <w:t>Arbeit der Fehlenden Person aufteilen</w:t>
+      <w:proofErr w:type="spellStart"/>
+      <w:r>
+        <w:rPr>
+          <w:lang w:val="en-GB"/>
+        </w:rPr>
+        <w:t>Krankheiten</w:t>
+      </w:r>
+      <w:proofErr w:type="spellEnd"/>
+      <w:r>
+        <w:rPr>
+          <w:lang w:val="en-GB"/>
+        </w:rPr>
+        <w:t>:</w:t>
       </w:r>
     </w:p>
     <w:p>
@@ -67,8 +61,165 @@
         <w:rPr>
           <w:lang w:val="de-DE"/>
         </w:rPr>
-        <w:t>Im fall eines Phantommitglied</w:t>
-      </w:r>
+        <w:t>Arbeit der Fehlenden Person aufteilen</w:t>
+      </w:r>
+    </w:p>
+    <w:p>
+      <w:pPr>
+        <w:rPr>
+          <w:lang w:val="de-DE"/>
+        </w:rPr>
+      </w:pPr>
+      <w:r>
+        <w:rPr>
+          <w:lang w:val="de-DE"/>
+        </w:rPr>
+        <w:t xml:space="preserve">Im </w:t>
+      </w:r>
+      <w:proofErr w:type="spellStart"/>
+      <w:r>
+        <w:rPr>
+          <w:lang w:val="de-DE"/>
+        </w:rPr>
+        <w:t>fall</w:t>
+      </w:r>
+      <w:proofErr w:type="spellEnd"/>
+      <w:r>
+        <w:rPr>
+          <w:lang w:val="de-DE"/>
+        </w:rPr>
+        <w:t xml:space="preserve"> eines Phantommitglied</w:t>
+      </w:r>
+      <w:r>
+        <w:rPr>
+          <w:lang w:val="de-DE"/>
+        </w:rPr>
+        <w:t xml:space="preserve"> nach 3 </w:t>
+      </w:r>
+      <w:proofErr w:type="spellStart"/>
+      <w:r>
+        <w:rPr>
+          <w:lang w:val="de-DE"/>
+        </w:rPr>
+        <w:t>wochen</w:t>
+      </w:r>
+      <w:proofErr w:type="spellEnd"/>
+      <w:r>
+        <w:rPr>
+          <w:lang w:val="de-DE"/>
+        </w:rPr>
+        <w:t xml:space="preserve"> nacheinander krank/abwesend bei Lehrperson melden.</w:t>
+      </w:r>
+    </w:p>
+    <w:p>
+      <w:pPr>
+        <w:rPr>
+          <w:lang w:val="de-DE"/>
+        </w:rPr>
+      </w:pPr>
+      <w:r>
+        <w:rPr>
+          <w:lang w:val="de-DE"/>
+        </w:rPr>
+        <w:t>Datenverlust:</w:t>
+      </w:r>
+      <w:r>
+        <w:rPr>
+          <w:lang w:val="de-DE"/>
+        </w:rPr>
+        <w:br/>
+        <w:t xml:space="preserve">Alles auf </w:t>
+      </w:r>
+      <w:proofErr w:type="spellStart"/>
+      <w:r>
+        <w:rPr>
+          <w:lang w:val="de-DE"/>
+        </w:rPr>
+        <w:t>git</w:t>
+      </w:r>
+      <w:proofErr w:type="spellEnd"/>
+      <w:r>
+        <w:rPr>
+          <w:lang w:val="de-DE"/>
+        </w:rPr>
+        <w:t xml:space="preserve"> gesichert, für den schlimmsten </w:t>
+      </w:r>
+      <w:proofErr w:type="spellStart"/>
+      <w:r>
+        <w:rPr>
+          <w:lang w:val="de-DE"/>
+        </w:rPr>
+        <w:t>fall</w:t>
+      </w:r>
+      <w:proofErr w:type="spellEnd"/>
+      <w:r>
+        <w:rPr>
+          <w:lang w:val="de-DE"/>
+        </w:rPr>
+        <w:t xml:space="preserve"> jede Woche Backup Kopie sichern.</w:t>
+      </w:r>
+    </w:p>
+    <w:p>
+      <w:pPr>
+        <w:rPr>
+          <w:lang w:val="de-DE"/>
+        </w:rPr>
+      </w:pPr>
+    </w:p>
+    <w:p>
+      <w:pPr>
+        <w:rPr>
+          <w:lang w:val="de-DE"/>
+        </w:rPr>
+      </w:pPr>
+    </w:p>
+    <w:p>
+      <w:pPr>
+        <w:rPr>
+          <w:lang w:val="de-DE"/>
+        </w:rPr>
+      </w:pPr>
+    </w:p>
+    <w:p>
+      <w:pPr>
+        <w:rPr>
+          <w:lang w:val="de-DE"/>
+        </w:rPr>
+      </w:pPr>
+    </w:p>
+    <w:p>
+      <w:pPr>
+        <w:rPr>
+          <w:lang w:val="de-DE"/>
+        </w:rPr>
+      </w:pPr>
+    </w:p>
+    <w:p>
+      <w:pPr>
+        <w:rPr>
+          <w:lang w:val="de-DE"/>
+        </w:rPr>
+      </w:pPr>
+      <w:r>
+        <w:rPr>
+          <w:lang w:val="de-DE"/>
+        </w:rPr>
+        <w:t>c</w:t>
+      </w:r>
+    </w:p>
+    <w:p>
+      <w:pPr>
+        <w:rPr>
+          <w:lang w:val="de-DE"/>
+        </w:rPr>
+      </w:pPr>
+    </w:p>
+    <w:p>
+      <w:pPr>
+        <w:rPr>
+          <w:lang w:val="de-DE"/>
+        </w:rPr>
+      </w:pPr>
     </w:p>
     <w:sectPr>
       <w:pgSz w:w="11906" w:h="16838"/>

</xml_diff>